<commit_message>
Actualizacion del Diagrama de Base Datos
</commit_message>
<xml_diff>
--- a/DOC/Informe de Tesis Dariel Cabrera Lopez con formato J.docx
+++ b/DOC/Informe de Tesis Dariel Cabrera Lopez con formato J.docx
@@ -15158,86 +15158,21 @@
           <w:shd w:val="clear" w:color="auto" w:fill="FFFFFF"/>
           <w:lang w:eastAsia="en-US"/>
         </w:rPr>
+        <w:lastRenderedPageBreak/>
         <w:commentReference w:id="112"/>
       </w:r>
-    </w:p>
-    <w:p>
-      <w:pPr>
-        <w:rPr>
-          <w:sz w:val="18"/>
-          <w:szCs w:val="18"/>
-        </w:rPr>
-      </w:pPr>
-      <w:commentRangeStart w:id="113"/>
-      <w:r>
-        <w:rPr>
-          <w:sz w:val="20"/>
-          <w:szCs w:val="20"/>
-        </w:rPr>
-        <w:t xml:space="preserve"> </w:t>
-      </w:r>
-      <w:r>
-        <w:rPr>
-          <w:sz w:val="18"/>
-          <w:szCs w:val="18"/>
-        </w:rPr>
-        <w:t xml:space="preserve">Figura 2.2   La clase usuario va a realizar muchos cálculos, estos cálculos ser realizan en una ubicación, en una ubicación se realiza muchos cálculos, </w:t>
-      </w:r>
-      <w:r>
-        <w:rPr>
-          <w:sz w:val="18"/>
-          <w:szCs w:val="18"/>
-        </w:rPr>
-        <w:t xml:space="preserve">y un usuario va tener varias trazas </w:t>
-      </w:r>
-      <w:commentRangeEnd w:id="113"/>
-      <w:r>
-        <w:rPr>
-          <w:rStyle w:val="Refdecomentario"/>
-          <w:rFonts w:eastAsiaTheme="minorHAnsi"/>
-          <w:color w:val="auto"/>
-          <w:sz w:val="18"/>
-          <w:szCs w:val="18"/>
-          <w:shd w:val="clear" w:color="auto" w:fill="FFFFFF"/>
-          <w:lang w:val="es-ES" w:eastAsia="en-US"/>
-        </w:rPr>
-        <w:commentReference w:id="113"/>
-      </w:r>
-    </w:p>
-    <w:p>
-      <w:pPr>
-        <w:pStyle w:val="Ttulo2"/>
-      </w:pPr>
-      <w:bookmarkStart w:id="114" w:name="_Toc193705056"/>
-      <w:bookmarkStart w:id="115" w:name="_Toc196374751"/>
-      <w:r>
-        <w:lastRenderedPageBreak/>
-        <w:t>Diagrama de Base de Datos</w:t>
-      </w:r>
-      <w:bookmarkEnd w:id="114"/>
-      <w:bookmarkEnd w:id="115"/>
-    </w:p>
-    <w:p>
-      <w:r>
-        <w:t>Un diagrama de base de datos es una representación visual de la estructura y relaciones entre los elementos de una base de datos.</w:t>
-      </w:r>
-    </w:p>
-    <w:p>
-      <w:pPr>
-        <w:rPr>
+      <w:r>
+        <w:rPr>
+          <w:rFonts w:cs="Arial"/>
           <w:noProof/>
-        </w:rPr>
-      </w:pPr>
-      <w:commentRangeStart w:id="116"/>
-      <w:r>
-        <w:rPr>
-          <w:noProof/>
+          <w:szCs w:val="22"/>
+          <w:lang w:val="es-CU"/>
         </w:rPr>
         <w:drawing>
-          <wp:inline distT="0" distB="0" distL="0" distR="0" wp14:anchorId="01059D1F" wp14:editId="3E2A1945">
-            <wp:extent cx="6210300" cy="2409825"/>
-            <wp:effectExtent l="0" t="0" r="0" b="9525"/>
-            <wp:docPr id="9" name="Imagen 9"/>
+          <wp:inline distT="0" distB="0" distL="0" distR="0" wp14:anchorId="66A358EE" wp14:editId="2990F9D8">
+            <wp:extent cx="5974080" cy="2453640"/>
+            <wp:effectExtent l="0" t="0" r="7620" b="3810"/>
+            <wp:docPr id="278948241" name="Imagen 22"/>
             <wp:cNvGraphicFramePr>
               <a:graphicFrameLocks xmlns:a="http://schemas.openxmlformats.org/drawingml/2006/main" noChangeAspect="1"/>
             </wp:cNvGraphicFramePr>
@@ -15266,7 +15201,7 @@
                   <pic:spPr bwMode="auto">
                     <a:xfrm>
                       <a:off x="0" y="0"/>
-                      <a:ext cx="6210300" cy="2409825"/>
+                      <a:ext cx="5974080" cy="2453640"/>
                     </a:xfrm>
                     <a:prstGeom prst="rect">
                       <a:avLst/>
@@ -15282,6 +15217,127 @@
           </wp:inline>
         </w:drawing>
       </w:r>
+    </w:p>
+    <w:p>
+      <w:pPr>
+        <w:rPr>
+          <w:sz w:val="18"/>
+          <w:szCs w:val="18"/>
+        </w:rPr>
+      </w:pPr>
+      <w:commentRangeStart w:id="113"/>
+      <w:r>
+        <w:rPr>
+          <w:sz w:val="20"/>
+          <w:szCs w:val="20"/>
+        </w:rPr>
+        <w:t xml:space="preserve"> </w:t>
+      </w:r>
+      <w:r>
+        <w:rPr>
+          <w:sz w:val="18"/>
+          <w:szCs w:val="18"/>
+        </w:rPr>
+        <w:t xml:space="preserve">Figura 2.2   La clase usuario va a realizar muchos cálculos, estos cálculos ser realizan en una ubicación, en una ubicación se realiza muchos cálculos, </w:t>
+      </w:r>
+      <w:r>
+        <w:rPr>
+          <w:sz w:val="18"/>
+          <w:szCs w:val="18"/>
+        </w:rPr>
+        <w:t xml:space="preserve">y un usuario va tener varias trazas </w:t>
+      </w:r>
+      <w:commentRangeEnd w:id="113"/>
+      <w:r>
+        <w:rPr>
+          <w:rStyle w:val="Refdecomentario"/>
+          <w:rFonts w:eastAsiaTheme="minorHAnsi"/>
+          <w:color w:val="auto"/>
+          <w:sz w:val="18"/>
+          <w:szCs w:val="18"/>
+          <w:shd w:val="clear" w:color="auto" w:fill="FFFFFF"/>
+          <w:lang w:val="es-ES" w:eastAsia="en-US"/>
+        </w:rPr>
+        <w:commentReference w:id="113"/>
+      </w:r>
+    </w:p>
+    <w:p>
+      <w:pPr>
+        <w:pStyle w:val="Ttulo2"/>
+      </w:pPr>
+      <w:bookmarkStart w:id="114" w:name="_Toc193705056"/>
+      <w:bookmarkStart w:id="115" w:name="_Toc196374751"/>
+      <w:r>
+        <w:t>Diagrama de Base de Datos</w:t>
+      </w:r>
+      <w:bookmarkEnd w:id="114"/>
+      <w:bookmarkEnd w:id="115"/>
+    </w:p>
+    <w:p>
+      <w:r>
+        <w:t>Un diagrama de base de datos es una representación visual de la estructura y relaciones entre los elementos de una base de datos.</w:t>
+      </w:r>
+    </w:p>
+    <w:p>
+      <w:pPr>
+        <w:rPr>
+          <w:noProof/>
+        </w:rPr>
+      </w:pPr>
+      <w:r>
+        <w:rPr>
+          <w:noProof/>
+        </w:rPr>
+        <w:drawing>
+          <wp:inline distT="0" distB="0" distL="0" distR="0" wp14:anchorId="5628BB87" wp14:editId="28C185F8">
+            <wp:extent cx="5974080" cy="3025140"/>
+            <wp:effectExtent l="0" t="0" r="7620" b="3810"/>
+            <wp:docPr id="674253039" name="Imagen 24"/>
+            <wp:cNvGraphicFramePr>
+              <a:graphicFrameLocks xmlns:a="http://schemas.openxmlformats.org/drawingml/2006/main" noChangeAspect="1"/>
+            </wp:cNvGraphicFramePr>
+            <a:graphic xmlns:a="http://schemas.openxmlformats.org/drawingml/2006/main">
+              <a:graphicData uri="http://schemas.openxmlformats.org/drawingml/2006/picture">
+                <pic:pic xmlns:pic="http://schemas.openxmlformats.org/drawingml/2006/picture">
+                  <pic:nvPicPr>
+                    <pic:cNvPr id="0" name="Picture 4"/>
+                    <pic:cNvPicPr>
+                      <a:picLocks noChangeAspect="1" noChangeArrowheads="1"/>
+                    </pic:cNvPicPr>
+                  </pic:nvPicPr>
+                  <pic:blipFill>
+                    <a:blip r:embed="rId68">
+                      <a:extLst>
+                        <a:ext uri="{28A0092B-C50C-407E-A947-70E740481C1C}">
+                          <a14:useLocalDpi xmlns:a14="http://schemas.microsoft.com/office/drawing/2010/main" val="0"/>
+                        </a:ext>
+                      </a:extLst>
+                    </a:blip>
+                    <a:srcRect/>
+                    <a:stretch>
+                      <a:fillRect/>
+                    </a:stretch>
+                  </pic:blipFill>
+                  <pic:spPr bwMode="auto">
+                    <a:xfrm>
+                      <a:off x="0" y="0"/>
+                      <a:ext cx="5974080" cy="3025140"/>
+                    </a:xfrm>
+                    <a:prstGeom prst="rect">
+                      <a:avLst/>
+                    </a:prstGeom>
+                    <a:noFill/>
+                    <a:ln>
+                      <a:noFill/>
+                    </a:ln>
+                  </pic:spPr>
+                </pic:pic>
+              </a:graphicData>
+            </a:graphic>
+          </wp:inline>
+        </w:drawing>
+      </w:r>
+      <w:commentRangeStart w:id="116"/>
       <w:commentRangeEnd w:id="116"/>
       <w:r>
         <w:rPr>
@@ -15314,6 +15370,7 @@
         <w:pStyle w:val="Ttulo2"/>
       </w:pPr>
       <w:r>
+        <w:lastRenderedPageBreak/>
         <w:t xml:space="preserve"> </w:t>
       </w:r>
       <w:r>
@@ -15388,7 +15445,6 @@
           <w:bCs/>
           <w:lang w:val="en-US"/>
         </w:rPr>
-        <w:lastRenderedPageBreak/>
         <w:t>Ventajas</w:t>
       </w:r>
       <w:proofErr w:type="spellEnd"/>
@@ -15656,6 +15712,7 @@
         <w:rPr>
           <w:lang w:val="es-ES"/>
         </w:rPr>
+        <w:lastRenderedPageBreak/>
         <w:t xml:space="preserve">● El uso de hipermedias para permitir al cliente navegar por los distintos recursos de una API REST a través de enlaces HTML. </w:t>
       </w:r>
     </w:p>
@@ -15843,7 +15900,6 @@
           <w:bCs/>
           <w:lang w:val="es-ES"/>
         </w:rPr>
-        <w:lastRenderedPageBreak/>
         <w:t>Seguridad</w:t>
       </w:r>
       <w:r>
@@ -16287,7 +16343,11 @@
         <w:t xml:space="preserve">Se </w:t>
       </w:r>
       <w:r>
-        <w:t xml:space="preserve">conciben como un estilo arquitectónico enfocado en desarrollar una aplicación mediante un conjunto de servicios, independientes, escalables, colaborativos, evolutivos, capaces de </w:t>
+        <w:t xml:space="preserve">conciben como un estilo arquitectónico enfocado en desarrollar una </w:t>
+      </w:r>
+      <w:r>
+        <w:lastRenderedPageBreak/>
+        <w:t xml:space="preserve">aplicación mediante un conjunto de servicios, independientes, escalables, colaborativos, evolutivos, capaces de </w:t>
       </w:r>
       <w:proofErr w:type="spellStart"/>
       <w:r>
@@ -16416,7 +16476,6 @@
           <w:bCs/>
           <w:lang w:val="es-ES"/>
         </w:rPr>
-        <w:lastRenderedPageBreak/>
         <w:t>Todos los servicios</w:t>
       </w:r>
       <w:r>
@@ -16613,6 +16672,7 @@
       </w:pPr>
       <w:commentRangeStart w:id="117"/>
       <w:r>
+        <w:lastRenderedPageBreak/>
         <w:t>Patrones de Microservicios</w:t>
       </w:r>
       <w:commentRangeEnd w:id="117"/>
@@ -16737,7 +16797,6 @@
         <w:rPr>
           <w:lang w:val="es-ES"/>
         </w:rPr>
-        <w:lastRenderedPageBreak/>
         <w:t xml:space="preserve">En el sistema de cálculo de sedimentos, este patrón se propone para coordinar operaciones entre el microservicio </w:t>
       </w:r>
       <w:proofErr w:type="spellStart"/>
@@ -16868,6 +16927,7 @@
         <w:rPr>
           <w:lang w:val="es-ES"/>
         </w:rPr>
+        <w:lastRenderedPageBreak/>
         <w:t>Reduce el acoplamiento entre servicios, mejorando la mantenibilidad.</w:t>
       </w:r>
     </w:p>
@@ -17051,14 +17111,7 @@
         <w:rPr>
           <w:lang w:val="es-ES"/>
         </w:rPr>
-        <w:t xml:space="preserve"> Breaker evitará seguir enviando solicitudes, permitiendo que el sistema </w:t>
-      </w:r>
-      <w:r>
-        <w:rPr>
-          <w:lang w:val="es-ES"/>
-        </w:rPr>
-        <w:lastRenderedPageBreak/>
-        <w:t>degrade su servicio de forma controlada, por ejemplo, devolviendo respuestas en caché, errores personalizados o notificaciones de mantenimiento</w:t>
+        <w:t xml:space="preserve"> Breaker evitará seguir enviando solicitudes, permitiendo que el sistema degrade su servicio de forma controlada, por ejemplo, devolviendo respuestas en caché, errores personalizados o notificaciones de mantenimiento</w:t>
       </w:r>
       <w:r>
         <w:rPr>
@@ -17352,6 +17405,7 @@
         <w:rPr>
           <w:lang w:val="es-ES"/>
         </w:rPr>
+        <w:lastRenderedPageBreak/>
         <w:t>Permite aplicar estrategias de respuesta alternativas (</w:t>
       </w:r>
       <w:proofErr w:type="spellStart"/>
@@ -17534,7 +17588,6 @@
         <w:rPr>
           <w:lang w:val="es-ES"/>
         </w:rPr>
-        <w:lastRenderedPageBreak/>
         <w:t>El acceso al sistema requerirá que el usuario se autentique mediante el ingreso de sus credenciales personales en el formulario de inicio de sesión. En ausencia de autenticación, no será posible acceder a la plataforma.</w:t>
       </w:r>
     </w:p>
@@ -17655,6 +17708,7 @@
         <w:rPr>
           <w:lang w:val="es-ES"/>
         </w:rPr>
+        <w:lastRenderedPageBreak/>
         <w:t>En caso de olvido de la contraseña de acceso, el usuario podrá solicitar al Administrador la asignación de una nueva clave.</w:t>
       </w:r>
     </w:p>
@@ -18432,7 +18486,7 @@
                     </pic:cNvPicPr>
                   </pic:nvPicPr>
                   <pic:blipFill>
-                    <a:blip r:embed="rId68">
+                    <a:blip r:embed="rId69">
                       <a:extLst>
                         <a:ext uri="{28A0092B-C50C-407E-A947-70E740481C1C}">
                           <a14:useLocalDpi xmlns:a14="http://schemas.microsoft.com/office/drawing/2010/main" val="0"/>
@@ -19384,7 +19438,7 @@
                     </pic:cNvPicPr>
                   </pic:nvPicPr>
                   <pic:blipFill>
-                    <a:blip r:embed="rId69">
+                    <a:blip r:embed="rId70">
                       <a:extLst>
                         <a:ext uri="{28A0092B-C50C-407E-A947-70E740481C1C}">
                           <a14:useLocalDpi xmlns:a14="http://schemas.microsoft.com/office/drawing/2010/main" val="0"/>
@@ -19532,7 +19586,7 @@
                     </pic:cNvPicPr>
                   </pic:nvPicPr>
                   <pic:blipFill>
-                    <a:blip r:embed="rId70">
+                    <a:blip r:embed="rId71">
                       <a:extLst>
                         <a:ext uri="{28A0092B-C50C-407E-A947-70E740481C1C}">
                           <a14:useLocalDpi xmlns:a14="http://schemas.microsoft.com/office/drawing/2010/main" val="0"/>
@@ -21903,7 +21957,7 @@
                     </pic:cNvPicPr>
                   </pic:nvPicPr>
                   <pic:blipFill>
-                    <a:blip r:embed="rId71">
+                    <a:blip r:embed="rId72">
                       <a:extLst>
                         <a:ext uri="{28A0092B-C50C-407E-A947-70E740481C1C}">
                           <a14:useLocalDpi xmlns:a14="http://schemas.microsoft.com/office/drawing/2010/main" val="0"/>
@@ -22062,7 +22116,7 @@
                     </pic:cNvPicPr>
                   </pic:nvPicPr>
                   <pic:blipFill>
-                    <a:blip r:embed="rId72">
+                    <a:blip r:embed="rId73">
                       <a:extLst>
                         <a:ext uri="{28A0092B-C50C-407E-A947-70E740481C1C}">
                           <a14:useLocalDpi xmlns:a14="http://schemas.microsoft.com/office/drawing/2010/main" val="0"/>
@@ -30196,12 +30250,12 @@
     <w:p>
       <w:pPr>
         <w:sectPr>
-          <w:headerReference w:type="even" r:id="rId73"/>
-          <w:headerReference w:type="default" r:id="rId74"/>
-          <w:footerReference w:type="even" r:id="rId75"/>
-          <w:footerReference w:type="default" r:id="rId76"/>
-          <w:headerReference w:type="first" r:id="rId77"/>
-          <w:footerReference w:type="first" r:id="rId78"/>
+          <w:headerReference w:type="even" r:id="rId74"/>
+          <w:headerReference w:type="default" r:id="rId75"/>
+          <w:footerReference w:type="even" r:id="rId76"/>
+          <w:footerReference w:type="default" r:id="rId77"/>
+          <w:headerReference w:type="first" r:id="rId78"/>
+          <w:footerReference w:type="first" r:id="rId79"/>
           <w:pgSz w:w="12240" w:h="15840"/>
           <w:pgMar w:top="725" w:right="1126" w:bottom="2517" w:left="1702" w:header="725" w:footer="981" w:gutter="0"/>
           <w:cols w:space="720"/>
@@ -30342,12 +30396,12 @@
       </w:r>
     </w:p>
     <w:sectPr>
-      <w:headerReference w:type="even" r:id="rId79"/>
-      <w:headerReference w:type="default" r:id="rId80"/>
-      <w:footerReference w:type="even" r:id="rId81"/>
-      <w:footerReference w:type="default" r:id="rId82"/>
-      <w:headerReference w:type="first" r:id="rId83"/>
-      <w:footerReference w:type="first" r:id="rId84"/>
+      <w:headerReference w:type="even" r:id="rId80"/>
+      <w:headerReference w:type="default" r:id="rId81"/>
+      <w:footerReference w:type="even" r:id="rId82"/>
+      <w:footerReference w:type="default" r:id="rId83"/>
+      <w:headerReference w:type="first" r:id="rId84"/>
+      <w:footerReference w:type="first" r:id="rId85"/>
       <w:pgSz w:w="12240" w:h="15840"/>
       <w:pgMar w:top="1440" w:right="1129" w:bottom="1440" w:left="1702" w:header="970" w:footer="720" w:gutter="0"/>
       <w:cols w:space="720"/>

</xml_diff>